<commit_message>
Arreglar retos y copiar, casos ficticios y material Word/PPT del curso.
Co-authored-by: Cursor <cursoragent@cursor.com>
</commit_message>
<xml_diff>
--- a/Manual-del-Alumno.docx
+++ b/Manual-del-Alumno.docx
@@ -51,31 +51,31 @@
         <w:spacing w:after="60"/>
       </w:pPr>
       <w:r>
-        <w:t xml:space="preserve">Abre el enlace que te comparta el instructor: https://xander0408.github.io/CURSOS/</w:t>
-      </w:r>
-    </w:p>
-    <w:p>
-      <w:pPr>
-        <w:numPr>
-          <w:ilvl w:val="0"/>
-          <w:numId w:val="1"/>
-        </w:numPr>
-        <w:spacing w:after="60"/>
-      </w:pPr>
-      <w:r>
-        <w:t xml:space="preserve">Úsalo en una ventana normal del navegador (no en modo incógnito), para que se guarde tu avance.</w:t>
-      </w:r>
-    </w:p>
-    <w:p>
-      <w:pPr>
-        <w:numPr>
-          <w:ilvl w:val="0"/>
-          <w:numId w:val="1"/>
-        </w:numPr>
-        <w:spacing w:after="60"/>
-      </w:pPr>
-      <w:r>
-        <w:t xml:space="preserve">En el Dashboard, escribe tu nombre y guárdalo.</w:t>
+        <w:t xml:space="preserve">Abre el enlace del instructor e inicia sesión con TU usuario y contraseña (no las compartas en voz alta).</w:t>
+      </w:r>
+    </w:p>
+    <w:p>
+      <w:pPr>
+        <w:numPr>
+          <w:ilvl w:val="0"/>
+          <w:numId w:val="1"/>
+        </w:numPr>
+        <w:spacing w:after="60"/>
+      </w:pPr>
+      <w:r>
+        <w:t xml:space="preserve">Úsalo en una ventana normal (no incógnito), para que se guarde tu avance.</w:t>
+      </w:r>
+    </w:p>
+    <w:p>
+      <w:pPr>
+        <w:numPr>
+          <w:ilvl w:val="0"/>
+          <w:numId w:val="1"/>
+        </w:numPr>
+        <w:spacing w:after="60"/>
+      </w:pPr>
+      <w:r>
+        <w:t xml:space="preserve">Sigue el orden: Conocernos → Cuentas gratis → Historia de la IA → módulos.</w:t>
       </w:r>
     </w:p>
     <w:p>
@@ -214,25 +214,101 @@
               <w:spacing w:after="0"/>
             </w:pPr>
             <w:r>
-              <w:t xml:space="preserve">Dashboard</w:t>
-            </w:r>
-          </w:p>
-        </w:tc>
-        <w:tc>
-          <w:tcPr>
-            <w:tcMar>
-              <w:top w:w="80" w:type="dxa"/>
-              <w:left w:w="100" w:type="dxa"/>
-              <w:bottom w:w="80" w:type="dxa"/>
-              <w:right w:w="100" w:type="dxa"/>
-            </w:tcMar>
-          </w:tcPr>
-          <w:p>
-            <w:pPr>
-              <w:spacing w:after="0"/>
-            </w:pPr>
-            <w:r>
-              <w:t xml:space="preserve">Tu progreso general y accesos rápidos.</w:t>
+              <w:t xml:space="preserve">Ruta</w:t>
+            </w:r>
+          </w:p>
+        </w:tc>
+        <w:tc>
+          <w:tcPr>
+            <w:tcMar>
+              <w:top w:w="80" w:type="dxa"/>
+              <w:left w:w="100" w:type="dxa"/>
+              <w:bottom w:w="80" w:type="dxa"/>
+              <w:right w:w="100" w:type="dxa"/>
+            </w:tcMar>
+          </w:tcPr>
+          <w:p>
+            <w:pPr>
+              <w:spacing w:after="0"/>
+            </w:pPr>
+            <w:r>
+              <w:t xml:space="preserve">Orden del curso y tu siguiente paso.</w:t>
+            </w:r>
+          </w:p>
+        </w:tc>
+      </w:tr>
+      <w:tr>
+        <w:tc>
+          <w:tcPr>
+            <w:tcMar>
+              <w:top w:w="80" w:type="dxa"/>
+              <w:left w:w="100" w:type="dxa"/>
+              <w:bottom w:w="80" w:type="dxa"/>
+              <w:right w:w="100" w:type="dxa"/>
+            </w:tcMar>
+          </w:tcPr>
+          <w:p>
+            <w:pPr>
+              <w:spacing w:after="0"/>
+            </w:pPr>
+            <w:r>
+              <w:t xml:space="preserve">Conocernos</w:t>
+            </w:r>
+          </w:p>
+        </w:tc>
+        <w:tc>
+          <w:tcPr>
+            <w:tcMar>
+              <w:top w:w="80" w:type="dxa"/>
+              <w:left w:w="100" w:type="dxa"/>
+              <w:bottom w:w="80" w:type="dxa"/>
+              <w:right w:w="100" w:type="dxa"/>
+            </w:tcMar>
+          </w:tcPr>
+          <w:p>
+            <w:pPr>
+              <w:spacing w:after="0"/>
+            </w:pPr>
+            <w:r>
+              <w:t xml:space="preserve">Quién eres en CISA y tu tarea asignada.</w:t>
+            </w:r>
+          </w:p>
+        </w:tc>
+      </w:tr>
+      <w:tr>
+        <w:tc>
+          <w:tcPr>
+            <w:tcMar>
+              <w:top w:w="80" w:type="dxa"/>
+              <w:left w:w="100" w:type="dxa"/>
+              <w:bottom w:w="80" w:type="dxa"/>
+              <w:right w:w="100" w:type="dxa"/>
+            </w:tcMar>
+          </w:tcPr>
+          <w:p>
+            <w:pPr>
+              <w:spacing w:after="0"/>
+            </w:pPr>
+            <w:r>
+              <w:t xml:space="preserve">Cuentas gratis</w:t>
+            </w:r>
+          </w:p>
+        </w:tc>
+        <w:tc>
+          <w:tcPr>
+            <w:tcMar>
+              <w:top w:w="80" w:type="dxa"/>
+              <w:left w:w="100" w:type="dxa"/>
+              <w:bottom w:w="80" w:type="dxa"/>
+              <w:right w:w="100" w:type="dxa"/>
+            </w:tcMar>
+          </w:tcPr>
+          <w:p>
+            <w:pPr>
+              <w:spacing w:after="0"/>
+            </w:pPr>
+            <w:r>
+              <w:t xml:space="preserve">Hasta dónde llegan ChatGPT y Claude Free.</w:t>
             </w:r>
           </w:p>
         </w:tc>
@@ -270,7 +346,45 @@
               <w:spacing w:after="0"/>
             </w:pPr>
             <w:r>
-              <w:t xml:space="preserve">Las 9 lecciones con sus retos.</w:t>
+              <w:t xml:space="preserve">Historia de la IA + 9 laboratorios con retos.</w:t>
+            </w:r>
+          </w:p>
+        </w:tc>
+      </w:tr>
+      <w:tr>
+        <w:tc>
+          <w:tcPr>
+            <w:tcMar>
+              <w:top w:w="80" w:type="dxa"/>
+              <w:left w:w="100" w:type="dxa"/>
+              <w:bottom w:w="80" w:type="dxa"/>
+              <w:right w:w="100" w:type="dxa"/>
+            </w:tcMar>
+          </w:tcPr>
+          <w:p>
+            <w:pPr>
+              <w:spacing w:after="0"/>
+            </w:pPr>
+            <w:r>
+              <w:t xml:space="preserve">Manual prompts</w:t>
+            </w:r>
+          </w:p>
+        </w:tc>
+        <w:tc>
+          <w:tcPr>
+            <w:tcMar>
+              <w:top w:w="80" w:type="dxa"/>
+              <w:left w:w="100" w:type="dxa"/>
+              <w:bottom w:w="80" w:type="dxa"/>
+              <w:right w:w="100" w:type="dxa"/>
+            </w:tcMar>
+          </w:tcPr>
+          <w:p>
+            <w:pPr>
+              <w:spacing w:after="0"/>
+            </w:pPr>
+            <w:r>
+              <w:t xml:space="preserve">Plantillas de 5 piezas para estudiar y copiar.</w:t>
             </w:r>
           </w:p>
         </w:tc>

</xml_diff>